<commit_message>
[SoC] - update Cache memory (refer [Pc])
</commit_message>
<xml_diff>
--- a/Learning/02_LINUX_SoC/01_Linux_Booting/Cache memory.docx
+++ b/Learning/02_LINUX_SoC/01_Linux_Booting/Cache memory.docx
@@ -49,6 +49,23 @@
     <w:p>
       <w:r>
         <w:t>+ When data is not used, it’s removed without affecting the performance</w:t>
+      </w:r>
+    </w:p>
+    <w:p>
+      <w:pPr>
+        <w:pBdr>
+          <w:bottom w:val="double" w:sz="6" w:space="1" w:color="auto"/>
+        </w:pBdr>
+      </w:pPr>
+    </w:p>
+    <w:p>
+      <w:r>
+        <w:t>CPU both can access data in DRAM and SRAM</w:t>
+      </w:r>
+    </w:p>
+    <w:p>
+      <w:r>
+        <w:t>SRAM – accessed faster -&gt; improve performance</w:t>
       </w:r>
     </w:p>
     <w:sectPr>

</xml_diff>